<commit_message>
fix: replace T2Q7 electrobezopasnost question with unambiguous one
Old: group by electrobezopasnost (key B=II group, correct C=III per POTEEU)
New: emergency stop button (key B, unambiguous)
</commit_message>
<xml_diff>
--- a/Оператор автоматических и полуавтоматических станков и линий станков/профессиональной переподготовки 15474 Оператор станков/05-1. ПО_ПП_ФОС_Оператор станков_2-3_разр.docx
+++ b/Оператор автоматических и полуавтоматических станков и линий станков/профессиональной переподготовки 15474 Оператор станков/05-1. ПО_ПП_ФОС_Оператор станков_2-3_разр.docx
@@ -3324,59 +3324,59 @@
           <w:b/>
           <w:sz w:val="28"/>
         </w:rPr>
-        <w:t>7. Какая группа по электробезопасности необходима оператору станка для самостоятельной работы с электрооборудованием?</w:t>
-      </w:r>
-    </w:p>
-    <w:p>
-      <w:pPr>
-        <w:ind w:left="567"/>
-      </w:pPr>
-      <w:r>
-        <w:rPr>
-          <w:rFonts w:ascii="Times New Roman" w:hAnsi="Times New Roman"/>
-          <w:b/>
-          <w:sz w:val="28"/>
-        </w:rPr>
-        <w:t>а) I группа;</w:t>
-      </w:r>
-    </w:p>
-    <w:p>
-      <w:pPr>
-        <w:ind w:left="567"/>
-      </w:pPr>
-      <w:r>
-        <w:rPr>
-          <w:rFonts w:ascii="Times New Roman" w:hAnsi="Times New Roman"/>
-          <w:b/>
-          <w:sz w:val="28"/>
-        </w:rPr>
-        <w:t>б) II группа;</w:t>
-      </w:r>
-    </w:p>
-    <w:p>
-      <w:pPr>
-        <w:ind w:left="567"/>
-      </w:pPr>
-      <w:r>
-        <w:rPr>
-          <w:rFonts w:ascii="Times New Roman" w:hAnsi="Times New Roman"/>
-          <w:b/>
-          <w:sz w:val="28"/>
-        </w:rPr>
-        <w:t>в) III группа;</w:t>
-      </w:r>
-    </w:p>
-    <w:p>
-      <w:pPr>
-        <w:ind w:left="567"/>
-      </w:pPr>
-      <w:r>
-        <w:rPr>
-          <w:rFonts w:ascii="Times New Roman" w:hAnsi="Times New Roman"/>
-          <w:b/>
-          <w:sz w:val="28"/>
-        </w:rPr>
-        <w:t>г) IV группа.</w:t>
+        <w:t>7. Какой орган управления станком предназначен для его экстренной остановки?</w:t>
+      </w:r>
+    </w:p>
+    <w:p>
+      <w:pPr>
+        <w:ind w:left="567"/>
+      </w:pPr>
+      <w:r>
+        <w:rPr>
+          <w:rFonts w:ascii="Times New Roman" w:hAnsi="Times New Roman"/>
+          <w:b/>
+          <w:sz w:val="28"/>
+        </w:rPr>
+        <w:t>а) Кнопка "Пуск";</w:t>
+      </w:r>
+    </w:p>
+    <w:p>
+      <w:pPr>
+        <w:ind w:left="567"/>
+      </w:pPr>
+      <w:r>
+        <w:rPr>
+          <w:rFonts w:ascii="Times New Roman" w:hAnsi="Times New Roman"/>
+          <w:b/>
+          <w:sz w:val="28"/>
+        </w:rPr>
+        <w:t>б) Кнопка аварийного остановки (красная грибовидная);</w:t>
+      </w:r>
+    </w:p>
+    <w:p>
+      <w:pPr>
+        <w:ind w:left="567"/>
+      </w:pPr>
+      <w:r>
+        <w:rPr>
+          <w:rFonts w:ascii="Times New Roman" w:hAnsi="Times New Roman"/>
+          <w:b/>
+          <w:sz w:val="28"/>
+        </w:rPr>
+        <w:t>в) Переключатель освещения;</w:t>
+      </w:r>
+    </w:p>
+    <w:p>
+      <w:pPr>
+        <w:ind w:left="567"/>
+      </w:pPr>
+      <w:r>
+        <w:rPr>
+          <w:rFonts w:ascii="Times New Roman" w:hAnsi="Times New Roman"/>
+          <w:b/>
+          <w:sz w:val="28"/>
+        </w:rPr>
+        <w:t>г) Рукоятка ручной подачи.</w:t>
       </w:r>
     </w:p>
     <w:p>

</xml_diff>